<commit_message>
Ajusta la ficha de cada sitio para mostrar fotos y descripción juntas.
Cada punto queda en una tarjeta con la foto a tamaño fijo y el texto de terreno debajo, listo para sumar más fotos por carpeta.

Co-authored-by: anibaloperacionesWes <anibaloperacionesWes@users.noreply.github.com>
</commit_message>
<xml_diff>
--- a/reports/Bupa_Antofagasta/PROPUESTA/Propuesta_monitoreo_Clinica_Bupa_Antofagasta.docx
+++ b/reports/Bupa_Antofagasta/PROPUESTA/Propuesta_monitoreo_Clinica_Bupa_Antofagasta.docx
@@ -1173,7 +1173,7 @@
     </w:p>
     <w:p>
       <w:pPr>
-        <w:spacing w:after="80" w:before="0" w:line="240" w:lineRule="auto"/>
+        <w:spacing w:after="40" w:before="0" w:line="240" w:lineRule="auto"/>
         <w:jc w:val="both"/>
       </w:pPr>
       <w:r>
@@ -1191,18 +1191,121 @@
         <w:tblW w:type="auto" w:w="0"/>
         <w:tblLayout w:type="autofit"/>
         <w:tblLook w:firstColumn="1" w:firstRow="1" w:lastColumn="0" w:lastRow="0" w:noHBand="0" w:noVBand="1" w:val="04A0"/>
+        <w:tblBorders>
+          <w:top w:val="single" w:sz="4" w:space="0" w:color="D0D7E2"/>
+          <w:left w:val="single" w:sz="4" w:space="0" w:color="D0D7E2"/>
+          <w:bottom w:val="single" w:sz="4" w:space="0" w:color="D0D7E2"/>
+          <w:right w:val="single" w:sz="4" w:space="0" w:color="D0D7E2"/>
+          <w:insideH w:val="single" w:sz="4" w:space="0" w:color="D0D7E2"/>
+          <w:insideV w:val="single" w:sz="4" w:space="0" w:color="D0D7E2"/>
+        </w:tblBorders>
       </w:tblPr>
       <w:tblGrid>
-        <w:gridCol w:w="4933"/>
-        <w:gridCol w:w="4933"/>
+        <w:gridCol w:w="9866"/>
       </w:tblGrid>
       <w:tr>
         <w:tc>
           <w:tcPr>
-            <w:tcW w:type="dxa" w:w="4933"/>
-            <w:shd w:fill="E8EEF6" w:val="clear"/>
+            <w:tcW w:type="dxa" w:w="9866"/>
+            <w:shd w:fill="F7F9FC" w:val="clear"/>
+            <w:tcMar>
+              <w:top w:w="60" w:type="dxa"/>
+              <w:left w:w="60" w:type="dxa"/>
+              <w:bottom w:w="60" w:type="dxa"/>
+              <w:right w:w="60" w:type="dxa"/>
+            </w:tcMar>
           </w:tcPr>
           <w:p>
+            <w:pPr>
+              <w:spacing w:before="80" w:after="40"/>
+              <w:jc w:val="center"/>
+            </w:pPr>
+            <w:r/>
+            <w:r>
+              <w:drawing>
+                <wp:inline xmlns:a="http://schemas.openxmlformats.org/drawingml/2006/main" xmlns:pic="http://schemas.openxmlformats.org/drawingml/2006/picture">
+                  <wp:extent cx="2707774" cy="2880000"/>
+                  <wp:docPr id="2" name="Picture 2"/>
+                  <wp:cNvGraphicFramePr>
+                    <a:graphicFrameLocks noChangeAspect="1"/>
+                  </wp:cNvGraphicFramePr>
+                  <a:graphic>
+                    <a:graphicData uri="http://schemas.openxmlformats.org/drawingml/2006/picture">
+                      <pic:pic>
+                        <pic:nvPicPr>
+                          <pic:cNvPr id="0" name="01.png"/>
+                          <pic:cNvPicPr/>
+                        </pic:nvPicPr>
+                        <pic:blipFill>
+                          <a:blip r:embed="rId11"/>
+                          <a:stretch>
+                            <a:fillRect/>
+                          </a:stretch>
+                        </pic:blipFill>
+                        <pic:spPr>
+                          <a:xfrm>
+                            <a:off x="0" y="0"/>
+                            <a:ext cx="2707774" cy="2880000"/>
+                          </a:xfrm>
+                          <a:prstGeom prst="rect"/>
+                        </pic:spPr>
+                      </pic:pic>
+                    </a:graphicData>
+                  </a:graphic>
+                </wp:inline>
+              </w:drawing>
+            </w:r>
+          </w:p>
+          <w:p>
+            <w:pPr>
+              <w:spacing w:after="40"/>
+              <w:jc w:val="center"/>
+            </w:pPr>
+            <w:r>
+              <w:rPr>
+                <w:rFonts w:ascii="Calibri" w:hAnsi="Calibri" w:eastAsia="Calibri"/>
+                <w:b/>
+                <w:color w:val="003366"/>
+                <w:sz w:val="16"/>
+              </w:rPr>
+              <w:t>Foto 1</w:t>
+            </w:r>
+          </w:p>
+        </w:tc>
+      </w:tr>
+    </w:tbl>
+    <w:tbl>
+      <w:tblPr>
+        <w:tblW w:type="auto" w:w="0"/>
+        <w:tblLook w:firstColumn="1" w:firstRow="1" w:lastColumn="0" w:lastRow="0" w:noHBand="0" w:noVBand="1" w:val="04A0"/>
+        <w:tblBorders>
+          <w:top w:val="single" w:sz="6" w:space="0" w:color="003366"/>
+          <w:left w:val="single" w:sz="6" w:space="0" w:color="003366"/>
+          <w:bottom w:val="single" w:sz="6" w:space="0" w:color="003366"/>
+          <w:right w:val="single" w:sz="6" w:space="0" w:color="003366"/>
+          <w:insideH w:val="single" w:sz="6" w:space="0" w:color="003366"/>
+          <w:insideV w:val="single" w:sz="6" w:space="0" w:color="003366"/>
+        </w:tblBorders>
+      </w:tblPr>
+      <w:tblGrid>
+        <w:gridCol w:w="9866"/>
+      </w:tblGrid>
+      <w:tr>
+        <w:tc>
+          <w:tcPr>
+            <w:tcW w:type="dxa" w:w="9866"/>
+            <w:shd w:fill="F4F7FB" w:val="clear"/>
+            <w:tcMar>
+              <w:top w:w="90" w:type="dxa"/>
+              <w:left w:w="90" w:type="dxa"/>
+              <w:bottom w:w="90" w:type="dxa"/>
+              <w:right w:w="90" w:type="dxa"/>
+            </w:tcMar>
+          </w:tcPr>
+          <w:p>
+            <w:pPr>
+              <w:spacing w:after="40"/>
+            </w:pPr>
             <w:r/>
             <w:r>
               <w:rPr>
@@ -1211,16 +1314,14 @@
                 <w:color w:val="003366"/>
                 <w:sz w:val="20"/>
               </w:rPr>
-              <w:t>Diámetro</w:t>
+              <w:t>Descripción del sitio</w:t>
             </w:r>
           </w:p>
-        </w:tc>
-        <w:tc>
-          <w:tcPr>
-            <w:tcW w:type="dxa" w:w="4933"/>
-          </w:tcPr>
           <w:p>
-            <w:r/>
+            <w:pPr>
+              <w:spacing w:after="80"/>
+              <w:jc w:val="both"/>
+            </w:pPr>
             <w:r>
               <w:rPr>
                 <w:rFonts w:ascii="Calibri" w:hAnsi="Calibri" w:eastAsia="Calibri"/>
@@ -1228,270 +1329,21 @@
                 <w:color w:val="000000"/>
                 <w:sz w:val="20"/>
               </w:rPr>
-              <w:t>2 pulgadas</w:t>
+              <w:t>Sala de bombas con manifold de cobre, válvulas y tramos verticales y horizontales accesibles para el par de sensores.</w:t>
             </w:r>
           </w:p>
-        </w:tc>
-      </w:tr>
-      <w:tr>
-        <w:tc>
-          <w:tcPr>
-            <w:tcW w:type="dxa" w:w="4933"/>
-            <w:shd w:fill="E8EEF6" w:val="clear"/>
-          </w:tcPr>
           <w:p>
-            <w:r/>
-            <w:r>
-              <w:rPr>
-                <w:rFonts w:ascii="Calibri" w:hAnsi="Calibri" w:eastAsia="Calibri"/>
-                <w:b/>
-                <w:color w:val="003366"/>
-                <w:sz w:val="20"/>
-              </w:rPr>
-              <w:t>Material de la matriz</w:t>
-            </w:r>
-          </w:p>
-        </w:tc>
-        <w:tc>
-          <w:tcPr>
-            <w:tcW w:type="dxa" w:w="4933"/>
-            <w:shd w:fill="F7F9FC" w:val="clear"/>
-          </w:tcPr>
-          <w:p>
-            <w:r/>
+            <w:pPr>
+              <w:spacing w:after="20"/>
+            </w:pPr>
             <w:r>
               <w:rPr>
                 <w:rFonts w:ascii="Calibri" w:hAnsi="Calibri" w:eastAsia="Calibri"/>
                 <w:b w:val="0"/>
-                <w:color w:val="000000"/>
-                <w:sz w:val="20"/>
+                <w:color w:val="464646"/>
+                <w:sz w:val="16"/>
               </w:rPr>
-              <w:t>Cobre</w:t>
-            </w:r>
-          </w:p>
-        </w:tc>
-      </w:tr>
-      <w:tr>
-        <w:tc>
-          <w:tcPr>
-            <w:tcW w:type="dxa" w:w="4933"/>
-            <w:shd w:fill="E8EEF6" w:val="clear"/>
-          </w:tcPr>
-          <w:p>
-            <w:r/>
-            <w:r>
-              <w:rPr>
-                <w:rFonts w:ascii="Calibri" w:hAnsi="Calibri" w:eastAsia="Calibri"/>
-                <w:b/>
-                <w:color w:val="003366"/>
-                <w:sz w:val="20"/>
-              </w:rPr>
-              <w:t>Actividad hídrica</w:t>
-            </w:r>
-          </w:p>
-        </w:tc>
-        <w:tc>
-          <w:tcPr>
-            <w:tcW w:type="dxa" w:w="4933"/>
-          </w:tcPr>
-          <w:p>
-            <w:r/>
-            <w:r>
-              <w:rPr>
-                <w:rFonts w:ascii="Calibri" w:hAnsi="Calibri" w:eastAsia="Calibri"/>
-                <w:b w:val="0"/>
-                <w:color w:val="000000"/>
-                <w:sz w:val="20"/>
-              </w:rPr>
-              <w:t>50 % de la clínica y llenado del estanque S.N°2</w:t>
-            </w:r>
-          </w:p>
-        </w:tc>
-      </w:tr>
-      <w:tr>
-        <w:tc>
-          <w:tcPr>
-            <w:tcW w:type="dxa" w:w="4933"/>
-            <w:shd w:fill="E8EEF6" w:val="clear"/>
-          </w:tcPr>
-          <w:p>
-            <w:r/>
-            <w:r>
-              <w:rPr>
-                <w:rFonts w:ascii="Calibri" w:hAnsi="Calibri" w:eastAsia="Calibri"/>
-                <w:b/>
-                <w:color w:val="003366"/>
-                <w:sz w:val="20"/>
-              </w:rPr>
-              <w:t>Remarcador del cliente</w:t>
-            </w:r>
-          </w:p>
-        </w:tc>
-        <w:tc>
-          <w:tcPr>
-            <w:tcW w:type="dxa" w:w="4933"/>
-            <w:shd w:fill="F7F9FC" w:val="clear"/>
-          </w:tcPr>
-          <w:p>
-            <w:r/>
-            <w:r>
-              <w:rPr>
-                <w:rFonts w:ascii="Calibri" w:hAnsi="Calibri" w:eastAsia="Calibri"/>
-                <w:b w:val="0"/>
-                <w:color w:val="000000"/>
-                <w:sz w:val="20"/>
-              </w:rPr>
-              <w:t>No existe</w:t>
-            </w:r>
-          </w:p>
-        </w:tc>
-      </w:tr>
-      <w:tr>
-        <w:tc>
-          <w:tcPr>
-            <w:tcW w:type="dxa" w:w="4933"/>
-            <w:shd w:fill="E8EEF6" w:val="clear"/>
-          </w:tcPr>
-          <w:p>
-            <w:r/>
-            <w:r>
-              <w:rPr>
-                <w:rFonts w:ascii="Calibri" w:hAnsi="Calibri" w:eastAsia="Calibri"/>
-                <w:b/>
-                <w:color w:val="003366"/>
-                <w:sz w:val="20"/>
-              </w:rPr>
-              <w:t>Factibilidad eléctrica 220 V</w:t>
-            </w:r>
-          </w:p>
-        </w:tc>
-        <w:tc>
-          <w:tcPr>
-            <w:tcW w:type="dxa" w:w="4933"/>
-          </w:tcPr>
-          <w:p>
-            <w:r/>
-            <w:r>
-              <w:rPr>
-                <w:rFonts w:ascii="Calibri" w:hAnsi="Calibri" w:eastAsia="Calibri"/>
-                <w:b w:val="0"/>
-                <w:color w:val="000000"/>
-                <w:sz w:val="20"/>
-              </w:rPr>
-              <w:t>10 m</w:t>
-            </w:r>
-          </w:p>
-        </w:tc>
-      </w:tr>
-      <w:tr>
-        <w:tc>
-          <w:tcPr>
-            <w:tcW w:type="dxa" w:w="4933"/>
-            <w:shd w:fill="E8EEF6" w:val="clear"/>
-          </w:tcPr>
-          <w:p>
-            <w:r/>
-            <w:r>
-              <w:rPr>
-                <w:rFonts w:ascii="Calibri" w:hAnsi="Calibri" w:eastAsia="Calibri"/>
-                <w:b/>
-                <w:color w:val="003366"/>
-                <w:sz w:val="20"/>
-              </w:rPr>
-              <w:t>Canalización de señal</w:t>
-            </w:r>
-          </w:p>
-        </w:tc>
-        <w:tc>
-          <w:tcPr>
-            <w:tcW w:type="dxa" w:w="4933"/>
-            <w:shd w:fill="F7F9FC" w:val="clear"/>
-          </w:tcPr>
-          <w:p>
-            <w:r/>
-            <w:r>
-              <w:rPr>
-                <w:rFonts w:ascii="Calibri" w:hAnsi="Calibri" w:eastAsia="Calibri"/>
-                <w:b w:val="0"/>
-                <w:color w:val="000000"/>
-                <w:sz w:val="20"/>
-              </w:rPr>
-              <w:t>No aplica</w:t>
-            </w:r>
-          </w:p>
-        </w:tc>
-      </w:tr>
-      <w:tr>
-        <w:tc>
-          <w:tcPr>
-            <w:tcW w:type="dxa" w:w="4933"/>
-            <w:shd w:fill="E8EEF6" w:val="clear"/>
-          </w:tcPr>
-          <w:p>
-            <w:r/>
-            <w:r>
-              <w:rPr>
-                <w:rFonts w:ascii="Calibri" w:hAnsi="Calibri" w:eastAsia="Calibri"/>
-                <w:b/>
-                <w:color w:val="003366"/>
-                <w:sz w:val="20"/>
-              </w:rPr>
-              <w:t>Canalización sensores ultrasonido</w:t>
-            </w:r>
-          </w:p>
-        </w:tc>
-        <w:tc>
-          <w:tcPr>
-            <w:tcW w:type="dxa" w:w="4933"/>
-          </w:tcPr>
-          <w:p>
-            <w:r/>
-            <w:r>
-              <w:rPr>
-                <w:rFonts w:ascii="Calibri" w:hAnsi="Calibri" w:eastAsia="Calibri"/>
-                <w:b w:val="0"/>
-                <w:color w:val="000000"/>
-                <w:sz w:val="20"/>
-              </w:rPr>
-              <w:t>2 × 5 m</w:t>
-            </w:r>
-          </w:p>
-        </w:tc>
-      </w:tr>
-      <w:tr>
-        <w:tc>
-          <w:tcPr>
-            <w:tcW w:type="dxa" w:w="4933"/>
-            <w:shd w:fill="E8EEF6" w:val="clear"/>
-          </w:tcPr>
-          <w:p>
-            <w:r/>
-            <w:r>
-              <w:rPr>
-                <w:rFonts w:ascii="Calibri" w:hAnsi="Calibri" w:eastAsia="Calibri"/>
-                <w:b/>
-                <w:color w:val="003366"/>
-                <w:sz w:val="20"/>
-              </w:rPr>
-              <w:t>Señal M2M 3G, 4G, 5G</w:t>
-            </w:r>
-          </w:p>
-        </w:tc>
-        <w:tc>
-          <w:tcPr>
-            <w:tcW w:type="dxa" w:w="4933"/>
-            <w:shd w:fill="F7F9FC" w:val="clear"/>
-          </w:tcPr>
-          <w:p>
-            <w:r/>
-            <w:r>
-              <w:rPr>
-                <w:rFonts w:ascii="Calibri" w:hAnsi="Calibri" w:eastAsia="Calibri"/>
-                <w:b w:val="0"/>
-                <w:color w:val="000000"/>
-                <w:sz w:val="20"/>
-              </w:rPr>
-              <w:t>Buena</w:t>
+              <w:t>Cobre 2 pulgadas  ·  50 % de la clínica y llenado del estanque S.N°2  ·  220 V a 10 m  ·  sensores 2 × 5 m  ·  señal M2M buena</w:t>
             </w:r>
           </w:p>
         </w:tc>
@@ -1499,67 +1351,12 @@
     </w:tbl>
     <w:p>
       <w:pPr>
-        <w:spacing w:after="80"/>
+        <w:spacing w:after="120"/>
       </w:pPr>
     </w:p>
     <w:p>
       <w:pPr>
-        <w:spacing w:before="120" w:after="40"/>
-        <w:jc w:val="center"/>
-      </w:pPr>
-      <w:r>
-        <w:drawing>
-          <wp:inline xmlns:a="http://schemas.openxmlformats.org/drawingml/2006/main" xmlns:pic="http://schemas.openxmlformats.org/drawingml/2006/picture">
-            <wp:extent cx="4206240" cy="4473775"/>
-            <wp:docPr id="2" name="Picture 2"/>
-            <wp:cNvGraphicFramePr>
-              <a:graphicFrameLocks noChangeAspect="1"/>
-            </wp:cNvGraphicFramePr>
-            <a:graphic>
-              <a:graphicData uri="http://schemas.openxmlformats.org/drawingml/2006/picture">
-                <pic:pic>
-                  <pic:nvPicPr>
-                    <pic:cNvPr id="0" name="principal.png"/>
-                    <pic:cNvPicPr/>
-                  </pic:nvPicPr>
-                  <pic:blipFill>
-                    <a:blip r:embed="rId11"/>
-                    <a:stretch>
-                      <a:fillRect/>
-                    </a:stretch>
-                  </pic:blipFill>
-                  <pic:spPr>
-                    <a:xfrm>
-                      <a:off x="0" y="0"/>
-                      <a:ext cx="4206240" cy="4473775"/>
-                    </a:xfrm>
-                    <a:prstGeom prst="rect"/>
-                  </pic:spPr>
-                </pic:pic>
-              </a:graphicData>
-            </a:graphic>
-          </wp:inline>
-        </w:drawing>
-      </w:r>
-    </w:p>
-    <w:p>
-      <w:pPr>
-        <w:spacing w:after="160"/>
-        <w:jc w:val="center"/>
-      </w:pPr>
-      <w:r>
-        <w:rPr>
-          <w:rFonts w:ascii="Calibri" w:hAnsi="Calibri" w:eastAsia="Calibri"/>
-          <w:b w:val="0"/>
-          <w:color w:val="505050"/>
-          <w:sz w:val="18"/>
-        </w:rPr>
-        <w:t>Sala de bombas con manifold de cobre, válvulas y tramos verticales y horizontales accesibles para el par de sensores.</w:t>
-      </w:r>
-    </w:p>
-    <w:p>
-      <w:pPr>
-        <w:spacing w:after="80" w:before="0" w:line="240" w:lineRule="auto"/>
+        <w:spacing w:after="40" w:before="0" w:line="240" w:lineRule="auto"/>
         <w:jc w:val="both"/>
       </w:pPr>
       <w:r>
@@ -1577,18 +1374,121 @@
         <w:tblW w:type="auto" w:w="0"/>
         <w:tblLayout w:type="autofit"/>
         <w:tblLook w:firstColumn="1" w:firstRow="1" w:lastColumn="0" w:lastRow="0" w:noHBand="0" w:noVBand="1" w:val="04A0"/>
+        <w:tblBorders>
+          <w:top w:val="single" w:sz="4" w:space="0" w:color="D0D7E2"/>
+          <w:left w:val="single" w:sz="4" w:space="0" w:color="D0D7E2"/>
+          <w:bottom w:val="single" w:sz="4" w:space="0" w:color="D0D7E2"/>
+          <w:right w:val="single" w:sz="4" w:space="0" w:color="D0D7E2"/>
+          <w:insideH w:val="single" w:sz="4" w:space="0" w:color="D0D7E2"/>
+          <w:insideV w:val="single" w:sz="4" w:space="0" w:color="D0D7E2"/>
+        </w:tblBorders>
       </w:tblPr>
       <w:tblGrid>
-        <w:gridCol w:w="4933"/>
-        <w:gridCol w:w="4933"/>
+        <w:gridCol w:w="9866"/>
       </w:tblGrid>
       <w:tr>
         <w:tc>
           <w:tcPr>
-            <w:tcW w:type="dxa" w:w="4933"/>
-            <w:shd w:fill="E8EEF6" w:val="clear"/>
+            <w:tcW w:type="dxa" w:w="9866"/>
+            <w:shd w:fill="F7F9FC" w:val="clear"/>
+            <w:tcMar>
+              <w:top w:w="60" w:type="dxa"/>
+              <w:left w:w="60" w:type="dxa"/>
+              <w:bottom w:w="60" w:type="dxa"/>
+              <w:right w:w="60" w:type="dxa"/>
+            </w:tcMar>
           </w:tcPr>
           <w:p>
+            <w:pPr>
+              <w:spacing w:before="80" w:after="40"/>
+              <w:jc w:val="center"/>
+            </w:pPr>
+            <w:r/>
+            <w:r>
+              <w:drawing>
+                <wp:inline xmlns:a="http://schemas.openxmlformats.org/drawingml/2006/main" xmlns:pic="http://schemas.openxmlformats.org/drawingml/2006/picture">
+                  <wp:extent cx="2489337" cy="2879999"/>
+                  <wp:docPr id="3" name="Picture 3"/>
+                  <wp:cNvGraphicFramePr>
+                    <a:graphicFrameLocks noChangeAspect="1"/>
+                  </wp:cNvGraphicFramePr>
+                  <a:graphic>
+                    <a:graphicData uri="http://schemas.openxmlformats.org/drawingml/2006/picture">
+                      <pic:pic>
+                        <pic:nvPicPr>
+                          <pic:cNvPr id="0" name="01.png"/>
+                          <pic:cNvPicPr/>
+                        </pic:nvPicPr>
+                        <pic:blipFill>
+                          <a:blip r:embed="rId12"/>
+                          <a:stretch>
+                            <a:fillRect/>
+                          </a:stretch>
+                        </pic:blipFill>
+                        <pic:spPr>
+                          <a:xfrm>
+                            <a:off x="0" y="0"/>
+                            <a:ext cx="2489337" cy="2879999"/>
+                          </a:xfrm>
+                          <a:prstGeom prst="rect"/>
+                        </pic:spPr>
+                      </pic:pic>
+                    </a:graphicData>
+                  </a:graphic>
+                </wp:inline>
+              </w:drawing>
+            </w:r>
+          </w:p>
+          <w:p>
+            <w:pPr>
+              <w:spacing w:after="40"/>
+              <w:jc w:val="center"/>
+            </w:pPr>
+            <w:r>
+              <w:rPr>
+                <w:rFonts w:ascii="Calibri" w:hAnsi="Calibri" w:eastAsia="Calibri"/>
+                <w:b/>
+                <w:color w:val="003366"/>
+                <w:sz w:val="16"/>
+              </w:rPr>
+              <w:t>Foto 1</w:t>
+            </w:r>
+          </w:p>
+        </w:tc>
+      </w:tr>
+    </w:tbl>
+    <w:tbl>
+      <w:tblPr>
+        <w:tblW w:type="auto" w:w="0"/>
+        <w:tblLook w:firstColumn="1" w:firstRow="1" w:lastColumn="0" w:lastRow="0" w:noHBand="0" w:noVBand="1" w:val="04A0"/>
+        <w:tblBorders>
+          <w:top w:val="single" w:sz="6" w:space="0" w:color="003366"/>
+          <w:left w:val="single" w:sz="6" w:space="0" w:color="003366"/>
+          <w:bottom w:val="single" w:sz="6" w:space="0" w:color="003366"/>
+          <w:right w:val="single" w:sz="6" w:space="0" w:color="003366"/>
+          <w:insideH w:val="single" w:sz="6" w:space="0" w:color="003366"/>
+          <w:insideV w:val="single" w:sz="6" w:space="0" w:color="003366"/>
+        </w:tblBorders>
+      </w:tblPr>
+      <w:tblGrid>
+        <w:gridCol w:w="9866"/>
+      </w:tblGrid>
+      <w:tr>
+        <w:tc>
+          <w:tcPr>
+            <w:tcW w:type="dxa" w:w="9866"/>
+            <w:shd w:fill="F4F7FB" w:val="clear"/>
+            <w:tcMar>
+              <w:top w:w="90" w:type="dxa"/>
+              <w:left w:w="90" w:type="dxa"/>
+              <w:bottom w:w="90" w:type="dxa"/>
+              <w:right w:w="90" w:type="dxa"/>
+            </w:tcMar>
+          </w:tcPr>
+          <w:p>
+            <w:pPr>
+              <w:spacing w:after="40"/>
+            </w:pPr>
             <w:r/>
             <w:r>
               <w:rPr>
@@ -1597,16 +1497,14 @@
                 <w:color w:val="003366"/>
                 <w:sz w:val="20"/>
               </w:rPr>
-              <w:t>Diámetro</w:t>
+              <w:t>Descripción del sitio</w:t>
             </w:r>
           </w:p>
-        </w:tc>
-        <w:tc>
-          <w:tcPr>
-            <w:tcW w:type="dxa" w:w="4933"/>
-          </w:tcPr>
           <w:p>
-            <w:r/>
+            <w:pPr>
+              <w:spacing w:after="80"/>
+              <w:jc w:val="both"/>
+            </w:pPr>
             <w:r>
               <w:rPr>
                 <w:rFonts w:ascii="Calibri" w:hAnsi="Calibri" w:eastAsia="Calibri"/>
@@ -1614,270 +1512,21 @@
                 <w:color w:val="000000"/>
                 <w:sz w:val="20"/>
               </w:rPr>
-              <w:t>2 pulgadas</w:t>
+              <w:t>Cuarto de impulsión con tuberías aisladas. En la fotografía de la visita hay una nota manuscrita: «Sala de impulsión 1 no se monitorea».</w:t>
             </w:r>
           </w:p>
-        </w:tc>
-      </w:tr>
-      <w:tr>
-        <w:tc>
-          <w:tcPr>
-            <w:tcW w:type="dxa" w:w="4933"/>
-            <w:shd w:fill="E8EEF6" w:val="clear"/>
-          </w:tcPr>
           <w:p>
-            <w:r/>
-            <w:r>
-              <w:rPr>
-                <w:rFonts w:ascii="Calibri" w:hAnsi="Calibri" w:eastAsia="Calibri"/>
-                <w:b/>
-                <w:color w:val="003366"/>
-                <w:sz w:val="20"/>
-              </w:rPr>
-              <w:t>Material de la matriz</w:t>
-            </w:r>
-          </w:p>
-        </w:tc>
-        <w:tc>
-          <w:tcPr>
-            <w:tcW w:type="dxa" w:w="4933"/>
-            <w:shd w:fill="F7F9FC" w:val="clear"/>
-          </w:tcPr>
-          <w:p>
-            <w:r/>
+            <w:pPr>
+              <w:spacing w:after="20"/>
+            </w:pPr>
             <w:r>
               <w:rPr>
                 <w:rFonts w:ascii="Calibri" w:hAnsi="Calibri" w:eastAsia="Calibri"/>
                 <w:b w:val="0"/>
-                <w:color w:val="000000"/>
-                <w:sz w:val="20"/>
+                <w:color w:val="464646"/>
+                <w:sz w:val="16"/>
               </w:rPr>
-              <w:t>Cobre</w:t>
-            </w:r>
-          </w:p>
-        </w:tc>
-      </w:tr>
-      <w:tr>
-        <w:tc>
-          <w:tcPr>
-            <w:tcW w:type="dxa" w:w="4933"/>
-            <w:shd w:fill="E8EEF6" w:val="clear"/>
-          </w:tcPr>
-          <w:p>
-            <w:r/>
-            <w:r>
-              <w:rPr>
-                <w:rFonts w:ascii="Calibri" w:hAnsi="Calibri" w:eastAsia="Calibri"/>
-                <w:b/>
-                <w:color w:val="003366"/>
-                <w:sz w:val="20"/>
-              </w:rPr>
-              <w:t>Actividad hídrica</w:t>
-            </w:r>
-          </w:p>
-        </w:tc>
-        <w:tc>
-          <w:tcPr>
-            <w:tcW w:type="dxa" w:w="4933"/>
-          </w:tcPr>
-          <w:p>
-            <w:r/>
-            <w:r>
-              <w:rPr>
-                <w:rFonts w:ascii="Calibri" w:hAnsi="Calibri" w:eastAsia="Calibri"/>
-                <w:b w:val="0"/>
-                <w:color w:val="000000"/>
-                <w:sz w:val="20"/>
-              </w:rPr>
-              <w:t>Abastece la sala de bombas del sexto piso (S.B. N°3)</w:t>
-            </w:r>
-          </w:p>
-        </w:tc>
-      </w:tr>
-      <w:tr>
-        <w:tc>
-          <w:tcPr>
-            <w:tcW w:type="dxa" w:w="4933"/>
-            <w:shd w:fill="E8EEF6" w:val="clear"/>
-          </w:tcPr>
-          <w:p>
-            <w:r/>
-            <w:r>
-              <w:rPr>
-                <w:rFonts w:ascii="Calibri" w:hAnsi="Calibri" w:eastAsia="Calibri"/>
-                <w:b/>
-                <w:color w:val="003366"/>
-                <w:sz w:val="20"/>
-              </w:rPr>
-              <w:t>Remarcador del cliente</w:t>
-            </w:r>
-          </w:p>
-        </w:tc>
-        <w:tc>
-          <w:tcPr>
-            <w:tcW w:type="dxa" w:w="4933"/>
-            <w:shd w:fill="F7F9FC" w:val="clear"/>
-          </w:tcPr>
-          <w:p>
-            <w:r/>
-            <w:r>
-              <w:rPr>
-                <w:rFonts w:ascii="Calibri" w:hAnsi="Calibri" w:eastAsia="Calibri"/>
-                <w:b w:val="0"/>
-                <w:color w:val="000000"/>
-                <w:sz w:val="20"/>
-              </w:rPr>
-              <w:t>No existe</w:t>
-            </w:r>
-          </w:p>
-        </w:tc>
-      </w:tr>
-      <w:tr>
-        <w:tc>
-          <w:tcPr>
-            <w:tcW w:type="dxa" w:w="4933"/>
-            <w:shd w:fill="E8EEF6" w:val="clear"/>
-          </w:tcPr>
-          <w:p>
-            <w:r/>
-            <w:r>
-              <w:rPr>
-                <w:rFonts w:ascii="Calibri" w:hAnsi="Calibri" w:eastAsia="Calibri"/>
-                <w:b/>
-                <w:color w:val="003366"/>
-                <w:sz w:val="20"/>
-              </w:rPr>
-              <w:t>Factibilidad eléctrica 220 V</w:t>
-            </w:r>
-          </w:p>
-        </w:tc>
-        <w:tc>
-          <w:tcPr>
-            <w:tcW w:type="dxa" w:w="4933"/>
-          </w:tcPr>
-          <w:p>
-            <w:r/>
-            <w:r>
-              <w:rPr>
-                <w:rFonts w:ascii="Calibri" w:hAnsi="Calibri" w:eastAsia="Calibri"/>
-                <w:b w:val="0"/>
-                <w:color w:val="000000"/>
-                <w:sz w:val="20"/>
-              </w:rPr>
-              <w:t>10 m</w:t>
-            </w:r>
-          </w:p>
-        </w:tc>
-      </w:tr>
-      <w:tr>
-        <w:tc>
-          <w:tcPr>
-            <w:tcW w:type="dxa" w:w="4933"/>
-            <w:shd w:fill="E8EEF6" w:val="clear"/>
-          </w:tcPr>
-          <w:p>
-            <w:r/>
-            <w:r>
-              <w:rPr>
-                <w:rFonts w:ascii="Calibri" w:hAnsi="Calibri" w:eastAsia="Calibri"/>
-                <w:b/>
-                <w:color w:val="003366"/>
-                <w:sz w:val="20"/>
-              </w:rPr>
-              <w:t>Canalización de señal</w:t>
-            </w:r>
-          </w:p>
-        </w:tc>
-        <w:tc>
-          <w:tcPr>
-            <w:tcW w:type="dxa" w:w="4933"/>
-            <w:shd w:fill="F7F9FC" w:val="clear"/>
-          </w:tcPr>
-          <w:p>
-            <w:r/>
-            <w:r>
-              <w:rPr>
-                <w:rFonts w:ascii="Calibri" w:hAnsi="Calibri" w:eastAsia="Calibri"/>
-                <w:b w:val="0"/>
-                <w:color w:val="000000"/>
-                <w:sz w:val="20"/>
-              </w:rPr>
-              <w:t>No aplica</w:t>
-            </w:r>
-          </w:p>
-        </w:tc>
-      </w:tr>
-      <w:tr>
-        <w:tc>
-          <w:tcPr>
-            <w:tcW w:type="dxa" w:w="4933"/>
-            <w:shd w:fill="E8EEF6" w:val="clear"/>
-          </w:tcPr>
-          <w:p>
-            <w:r/>
-            <w:r>
-              <w:rPr>
-                <w:rFonts w:ascii="Calibri" w:hAnsi="Calibri" w:eastAsia="Calibri"/>
-                <w:b/>
-                <w:color w:val="003366"/>
-                <w:sz w:val="20"/>
-              </w:rPr>
-              <w:t>Canalización sensores ultrasonido</w:t>
-            </w:r>
-          </w:p>
-        </w:tc>
-        <w:tc>
-          <w:tcPr>
-            <w:tcW w:type="dxa" w:w="4933"/>
-          </w:tcPr>
-          <w:p>
-            <w:r/>
-            <w:r>
-              <w:rPr>
-                <w:rFonts w:ascii="Calibri" w:hAnsi="Calibri" w:eastAsia="Calibri"/>
-                <w:b w:val="0"/>
-                <w:color w:val="000000"/>
-                <w:sz w:val="20"/>
-              </w:rPr>
-              <w:t>2 × 5 m</w:t>
-            </w:r>
-          </w:p>
-        </w:tc>
-      </w:tr>
-      <w:tr>
-        <w:tc>
-          <w:tcPr>
-            <w:tcW w:type="dxa" w:w="4933"/>
-            <w:shd w:fill="E8EEF6" w:val="clear"/>
-          </w:tcPr>
-          <w:p>
-            <w:r/>
-            <w:r>
-              <w:rPr>
-                <w:rFonts w:ascii="Calibri" w:hAnsi="Calibri" w:eastAsia="Calibri"/>
-                <w:b/>
-                <w:color w:val="003366"/>
-                <w:sz w:val="20"/>
-              </w:rPr>
-              <w:t>Señal M2M 3G, 4G, 5G</w:t>
-            </w:r>
-          </w:p>
-        </w:tc>
-        <w:tc>
-          <w:tcPr>
-            <w:tcW w:type="dxa" w:w="4933"/>
-            <w:shd w:fill="F7F9FC" w:val="clear"/>
-          </w:tcPr>
-          <w:p>
-            <w:r/>
-            <w:r>
-              <w:rPr>
-                <w:rFonts w:ascii="Calibri" w:hAnsi="Calibri" w:eastAsia="Calibri"/>
-                <w:b w:val="0"/>
-                <w:color w:val="000000"/>
-                <w:sz w:val="20"/>
-              </w:rPr>
-              <w:t>Buena</w:t>
+              <w:t>Cobre 2 pulgadas  ·  Abastece la sala de bombas del sexto piso (S.B. N°3)  ·  220 V a 10 m  ·  sensores 2 × 5 m  ·  señal M2M buena</w:t>
             </w:r>
           </w:p>
         </w:tc>
@@ -1885,67 +1534,12 @@
     </w:tbl>
     <w:p>
       <w:pPr>
-        <w:spacing w:after="80"/>
+        <w:spacing w:after="120"/>
       </w:pPr>
     </w:p>
     <w:p>
       <w:pPr>
-        <w:spacing w:before="120" w:after="40"/>
-        <w:jc w:val="center"/>
-      </w:pPr>
-      <w:r>
-        <w:drawing>
-          <wp:inline xmlns:a="http://schemas.openxmlformats.org/drawingml/2006/main" xmlns:pic="http://schemas.openxmlformats.org/drawingml/2006/picture">
-            <wp:extent cx="4206240" cy="4866343"/>
-            <wp:docPr id="3" name="Picture 3"/>
-            <wp:cNvGraphicFramePr>
-              <a:graphicFrameLocks noChangeAspect="1"/>
-            </wp:cNvGraphicFramePr>
-            <a:graphic>
-              <a:graphicData uri="http://schemas.openxmlformats.org/drawingml/2006/picture">
-                <pic:pic>
-                  <pic:nvPicPr>
-                    <pic:cNvPr id="0" name="sala2.png"/>
-                    <pic:cNvPicPr/>
-                  </pic:nvPicPr>
-                  <pic:blipFill>
-                    <a:blip r:embed="rId12"/>
-                    <a:stretch>
-                      <a:fillRect/>
-                    </a:stretch>
-                  </pic:blipFill>
-                  <pic:spPr>
-                    <a:xfrm>
-                      <a:off x="0" y="0"/>
-                      <a:ext cx="4206240" cy="4866343"/>
-                    </a:xfrm>
-                    <a:prstGeom prst="rect"/>
-                  </pic:spPr>
-                </pic:pic>
-              </a:graphicData>
-            </a:graphic>
-          </wp:inline>
-        </w:drawing>
-      </w:r>
-    </w:p>
-    <w:p>
-      <w:pPr>
-        <w:spacing w:after="160"/>
-        <w:jc w:val="center"/>
-      </w:pPr>
-      <w:r>
-        <w:rPr>
-          <w:rFonts w:ascii="Calibri" w:hAnsi="Calibri" w:eastAsia="Calibri"/>
-          <w:b w:val="0"/>
-          <w:color w:val="505050"/>
-          <w:sz w:val="18"/>
-        </w:rPr>
-        <w:t>Cuarto de impulsión con tuberías aisladas. En la fotografía de la visita hay una nota manuscrita: «Sala de impulsión 1 no se monitorea».</w:t>
-      </w:r>
-    </w:p>
-    <w:p>
-      <w:pPr>
-        <w:spacing w:after="80" w:before="0" w:line="240" w:lineRule="auto"/>
+        <w:spacing w:after="40" w:before="0" w:line="240" w:lineRule="auto"/>
         <w:jc w:val="both"/>
       </w:pPr>
       <w:r>
@@ -1963,18 +1557,121 @@
         <w:tblW w:type="auto" w:w="0"/>
         <w:tblLayout w:type="autofit"/>
         <w:tblLook w:firstColumn="1" w:firstRow="1" w:lastColumn="0" w:lastRow="0" w:noHBand="0" w:noVBand="1" w:val="04A0"/>
+        <w:tblBorders>
+          <w:top w:val="single" w:sz="4" w:space="0" w:color="D0D7E2"/>
+          <w:left w:val="single" w:sz="4" w:space="0" w:color="D0D7E2"/>
+          <w:bottom w:val="single" w:sz="4" w:space="0" w:color="D0D7E2"/>
+          <w:right w:val="single" w:sz="4" w:space="0" w:color="D0D7E2"/>
+          <w:insideH w:val="single" w:sz="4" w:space="0" w:color="D0D7E2"/>
+          <w:insideV w:val="single" w:sz="4" w:space="0" w:color="D0D7E2"/>
+        </w:tblBorders>
       </w:tblPr>
       <w:tblGrid>
-        <w:gridCol w:w="4933"/>
-        <w:gridCol w:w="4933"/>
+        <w:gridCol w:w="9866"/>
       </w:tblGrid>
       <w:tr>
         <w:tc>
           <w:tcPr>
-            <w:tcW w:type="dxa" w:w="4933"/>
-            <w:shd w:fill="E8EEF6" w:val="clear"/>
+            <w:tcW w:type="dxa" w:w="9866"/>
+            <w:shd w:fill="F7F9FC" w:val="clear"/>
+            <w:tcMar>
+              <w:top w:w="60" w:type="dxa"/>
+              <w:left w:w="60" w:type="dxa"/>
+              <w:bottom w:w="60" w:type="dxa"/>
+              <w:right w:w="60" w:type="dxa"/>
+            </w:tcMar>
           </w:tcPr>
           <w:p>
+            <w:pPr>
+              <w:spacing w:before="80" w:after="40"/>
+              <w:jc w:val="center"/>
+            </w:pPr>
+            <w:r/>
+            <w:r>
+              <w:drawing>
+                <wp:inline xmlns:a="http://schemas.openxmlformats.org/drawingml/2006/main" xmlns:pic="http://schemas.openxmlformats.org/drawingml/2006/picture">
+                  <wp:extent cx="3229090" cy="2880000"/>
+                  <wp:docPr id="4" name="Picture 4"/>
+                  <wp:cNvGraphicFramePr>
+                    <a:graphicFrameLocks noChangeAspect="1"/>
+                  </wp:cNvGraphicFramePr>
+                  <a:graphic>
+                    <a:graphicData uri="http://schemas.openxmlformats.org/drawingml/2006/picture">
+                      <pic:pic>
+                        <pic:nvPicPr>
+                          <pic:cNvPr id="0" name="01.png"/>
+                          <pic:cNvPicPr/>
+                        </pic:nvPicPr>
+                        <pic:blipFill>
+                          <a:blip r:embed="rId13"/>
+                          <a:stretch>
+                            <a:fillRect/>
+                          </a:stretch>
+                        </pic:blipFill>
+                        <pic:spPr>
+                          <a:xfrm>
+                            <a:off x="0" y="0"/>
+                            <a:ext cx="3229090" cy="2880000"/>
+                          </a:xfrm>
+                          <a:prstGeom prst="rect"/>
+                        </pic:spPr>
+                      </pic:pic>
+                    </a:graphicData>
+                  </a:graphic>
+                </wp:inline>
+              </w:drawing>
+            </w:r>
+          </w:p>
+          <w:p>
+            <w:pPr>
+              <w:spacing w:after="40"/>
+              <w:jc w:val="center"/>
+            </w:pPr>
+            <w:r>
+              <w:rPr>
+                <w:rFonts w:ascii="Calibri" w:hAnsi="Calibri" w:eastAsia="Calibri"/>
+                <w:b/>
+                <w:color w:val="003366"/>
+                <w:sz w:val="16"/>
+              </w:rPr>
+              <w:t>Foto 1</w:t>
+            </w:r>
+          </w:p>
+        </w:tc>
+      </w:tr>
+    </w:tbl>
+    <w:tbl>
+      <w:tblPr>
+        <w:tblW w:type="auto" w:w="0"/>
+        <w:tblLook w:firstColumn="1" w:firstRow="1" w:lastColumn="0" w:lastRow="0" w:noHBand="0" w:noVBand="1" w:val="04A0"/>
+        <w:tblBorders>
+          <w:top w:val="single" w:sz="6" w:space="0" w:color="003366"/>
+          <w:left w:val="single" w:sz="6" w:space="0" w:color="003366"/>
+          <w:bottom w:val="single" w:sz="6" w:space="0" w:color="003366"/>
+          <w:right w:val="single" w:sz="6" w:space="0" w:color="003366"/>
+          <w:insideH w:val="single" w:sz="6" w:space="0" w:color="003366"/>
+          <w:insideV w:val="single" w:sz="6" w:space="0" w:color="003366"/>
+        </w:tblBorders>
+      </w:tblPr>
+      <w:tblGrid>
+        <w:gridCol w:w="9866"/>
+      </w:tblGrid>
+      <w:tr>
+        <w:tc>
+          <w:tcPr>
+            <w:tcW w:type="dxa" w:w="9866"/>
+            <w:shd w:fill="F4F7FB" w:val="clear"/>
+            <w:tcMar>
+              <w:top w:w="90" w:type="dxa"/>
+              <w:left w:w="90" w:type="dxa"/>
+              <w:bottom w:w="90" w:type="dxa"/>
+              <w:right w:w="90" w:type="dxa"/>
+            </w:tcMar>
+          </w:tcPr>
+          <w:p>
+            <w:pPr>
+              <w:spacing w:after="40"/>
+            </w:pPr>
             <w:r/>
             <w:r>
               <w:rPr>
@@ -1983,16 +1680,14 @@
                 <w:color w:val="003366"/>
                 <w:sz w:val="20"/>
               </w:rPr>
-              <w:t>Diámetro</w:t>
+              <w:t>Descripción del sitio</w:t>
             </w:r>
           </w:p>
-        </w:tc>
-        <w:tc>
-          <w:tcPr>
-            <w:tcW w:type="dxa" w:w="4933"/>
-          </w:tcPr>
           <w:p>
-            <w:r/>
+            <w:pPr>
+              <w:spacing w:after="80"/>
+              <w:jc w:val="both"/>
+            </w:pPr>
             <w:r>
               <w:rPr>
                 <w:rFonts w:ascii="Calibri" w:hAnsi="Calibri" w:eastAsia="Calibri"/>
@@ -2000,270 +1695,21 @@
                 <w:color w:val="000000"/>
                 <w:sz w:val="20"/>
               </w:rPr>
-              <w:t>2 pulgadas</w:t>
+              <w:t>Bomba del sexto piso sobre base de concreto, con aislación en la tubería. El piso de la sala estaba mojado el día de la visita.</w:t>
             </w:r>
           </w:p>
-        </w:tc>
-      </w:tr>
-      <w:tr>
-        <w:tc>
-          <w:tcPr>
-            <w:tcW w:type="dxa" w:w="4933"/>
-            <w:shd w:fill="E8EEF6" w:val="clear"/>
-          </w:tcPr>
           <w:p>
-            <w:r/>
-            <w:r>
-              <w:rPr>
-                <w:rFonts w:ascii="Calibri" w:hAnsi="Calibri" w:eastAsia="Calibri"/>
-                <w:b/>
-                <w:color w:val="003366"/>
-                <w:sz w:val="20"/>
-              </w:rPr>
-              <w:t>Material de la matriz</w:t>
-            </w:r>
-          </w:p>
-        </w:tc>
-        <w:tc>
-          <w:tcPr>
-            <w:tcW w:type="dxa" w:w="4933"/>
-            <w:shd w:fill="F7F9FC" w:val="clear"/>
-          </w:tcPr>
-          <w:p>
-            <w:r/>
+            <w:pPr>
+              <w:spacing w:after="20"/>
+            </w:pPr>
             <w:r>
               <w:rPr>
                 <w:rFonts w:ascii="Calibri" w:hAnsi="Calibri" w:eastAsia="Calibri"/>
                 <w:b w:val="0"/>
-                <w:color w:val="000000"/>
-                <w:sz w:val="20"/>
+                <w:color w:val="464646"/>
+                <w:sz w:val="16"/>
               </w:rPr>
-              <w:t>Cobre</w:t>
-            </w:r>
-          </w:p>
-        </w:tc>
-      </w:tr>
-      <w:tr>
-        <w:tc>
-          <w:tcPr>
-            <w:tcW w:type="dxa" w:w="4933"/>
-            <w:shd w:fill="E8EEF6" w:val="clear"/>
-          </w:tcPr>
-          <w:p>
-            <w:r/>
-            <w:r>
-              <w:rPr>
-                <w:rFonts w:ascii="Calibri" w:hAnsi="Calibri" w:eastAsia="Calibri"/>
-                <w:b/>
-                <w:color w:val="003366"/>
-                <w:sz w:val="20"/>
-              </w:rPr>
-              <w:t>Actividad hídrica</w:t>
-            </w:r>
-          </w:p>
-        </w:tc>
-        <w:tc>
-          <w:tcPr>
-            <w:tcW w:type="dxa" w:w="4933"/>
-          </w:tcPr>
-          <w:p>
-            <w:r/>
-            <w:r>
-              <w:rPr>
-                <w:rFonts w:ascii="Calibri" w:hAnsi="Calibri" w:eastAsia="Calibri"/>
-                <w:b w:val="0"/>
-                <w:color w:val="000000"/>
-                <w:sz w:val="20"/>
-              </w:rPr>
-              <w:t>50 % de la clínica</w:t>
-            </w:r>
-          </w:p>
-        </w:tc>
-      </w:tr>
-      <w:tr>
-        <w:tc>
-          <w:tcPr>
-            <w:tcW w:type="dxa" w:w="4933"/>
-            <w:shd w:fill="E8EEF6" w:val="clear"/>
-          </w:tcPr>
-          <w:p>
-            <w:r/>
-            <w:r>
-              <w:rPr>
-                <w:rFonts w:ascii="Calibri" w:hAnsi="Calibri" w:eastAsia="Calibri"/>
-                <w:b/>
-                <w:color w:val="003366"/>
-                <w:sz w:val="20"/>
-              </w:rPr>
-              <w:t>Remarcador del cliente</w:t>
-            </w:r>
-          </w:p>
-        </w:tc>
-        <w:tc>
-          <w:tcPr>
-            <w:tcW w:type="dxa" w:w="4933"/>
-            <w:shd w:fill="F7F9FC" w:val="clear"/>
-          </w:tcPr>
-          <w:p>
-            <w:r/>
-            <w:r>
-              <w:rPr>
-                <w:rFonts w:ascii="Calibri" w:hAnsi="Calibri" w:eastAsia="Calibri"/>
-                <w:b w:val="0"/>
-                <w:color w:val="000000"/>
-                <w:sz w:val="20"/>
-              </w:rPr>
-              <w:t>No existe</w:t>
-            </w:r>
-          </w:p>
-        </w:tc>
-      </w:tr>
-      <w:tr>
-        <w:tc>
-          <w:tcPr>
-            <w:tcW w:type="dxa" w:w="4933"/>
-            <w:shd w:fill="E8EEF6" w:val="clear"/>
-          </w:tcPr>
-          <w:p>
-            <w:r/>
-            <w:r>
-              <w:rPr>
-                <w:rFonts w:ascii="Calibri" w:hAnsi="Calibri" w:eastAsia="Calibri"/>
-                <w:b/>
-                <w:color w:val="003366"/>
-                <w:sz w:val="20"/>
-              </w:rPr>
-              <w:t>Factibilidad eléctrica 220 V</w:t>
-            </w:r>
-          </w:p>
-        </w:tc>
-        <w:tc>
-          <w:tcPr>
-            <w:tcW w:type="dxa" w:w="4933"/>
-          </w:tcPr>
-          <w:p>
-            <w:r/>
-            <w:r>
-              <w:rPr>
-                <w:rFonts w:ascii="Calibri" w:hAnsi="Calibri" w:eastAsia="Calibri"/>
-                <w:b w:val="0"/>
-                <w:color w:val="000000"/>
-                <w:sz w:val="20"/>
-              </w:rPr>
-              <w:t>15 m</w:t>
-            </w:r>
-          </w:p>
-        </w:tc>
-      </w:tr>
-      <w:tr>
-        <w:tc>
-          <w:tcPr>
-            <w:tcW w:type="dxa" w:w="4933"/>
-            <w:shd w:fill="E8EEF6" w:val="clear"/>
-          </w:tcPr>
-          <w:p>
-            <w:r/>
-            <w:r>
-              <w:rPr>
-                <w:rFonts w:ascii="Calibri" w:hAnsi="Calibri" w:eastAsia="Calibri"/>
-                <w:b/>
-                <w:color w:val="003366"/>
-                <w:sz w:val="20"/>
-              </w:rPr>
-              <w:t>Canalización de señal</w:t>
-            </w:r>
-          </w:p>
-        </w:tc>
-        <w:tc>
-          <w:tcPr>
-            <w:tcW w:type="dxa" w:w="4933"/>
-            <w:shd w:fill="F7F9FC" w:val="clear"/>
-          </w:tcPr>
-          <w:p>
-            <w:r/>
-            <w:r>
-              <w:rPr>
-                <w:rFonts w:ascii="Calibri" w:hAnsi="Calibri" w:eastAsia="Calibri"/>
-                <w:b w:val="0"/>
-                <w:color w:val="000000"/>
-                <w:sz w:val="20"/>
-              </w:rPr>
-              <w:t>No aplica</w:t>
-            </w:r>
-          </w:p>
-        </w:tc>
-      </w:tr>
-      <w:tr>
-        <w:tc>
-          <w:tcPr>
-            <w:tcW w:type="dxa" w:w="4933"/>
-            <w:shd w:fill="E8EEF6" w:val="clear"/>
-          </w:tcPr>
-          <w:p>
-            <w:r/>
-            <w:r>
-              <w:rPr>
-                <w:rFonts w:ascii="Calibri" w:hAnsi="Calibri" w:eastAsia="Calibri"/>
-                <w:b/>
-                <w:color w:val="003366"/>
-                <w:sz w:val="20"/>
-              </w:rPr>
-              <w:t>Canalización sensores ultrasonido</w:t>
-            </w:r>
-          </w:p>
-        </w:tc>
-        <w:tc>
-          <w:tcPr>
-            <w:tcW w:type="dxa" w:w="4933"/>
-          </w:tcPr>
-          <w:p>
-            <w:r/>
-            <w:r>
-              <w:rPr>
-                <w:rFonts w:ascii="Calibri" w:hAnsi="Calibri" w:eastAsia="Calibri"/>
-                <w:b w:val="0"/>
-                <w:color w:val="000000"/>
-                <w:sz w:val="20"/>
-              </w:rPr>
-              <w:t>2 × 5 m</w:t>
-            </w:r>
-          </w:p>
-        </w:tc>
-      </w:tr>
-      <w:tr>
-        <w:tc>
-          <w:tcPr>
-            <w:tcW w:type="dxa" w:w="4933"/>
-            <w:shd w:fill="E8EEF6" w:val="clear"/>
-          </w:tcPr>
-          <w:p>
-            <w:r/>
-            <w:r>
-              <w:rPr>
-                <w:rFonts w:ascii="Calibri" w:hAnsi="Calibri" w:eastAsia="Calibri"/>
-                <w:b/>
-                <w:color w:val="003366"/>
-                <w:sz w:val="20"/>
-              </w:rPr>
-              <w:t>Señal M2M 3G, 4G, 5G</w:t>
-            </w:r>
-          </w:p>
-        </w:tc>
-        <w:tc>
-          <w:tcPr>
-            <w:tcW w:type="dxa" w:w="4933"/>
-            <w:shd w:fill="F7F9FC" w:val="clear"/>
-          </w:tcPr>
-          <w:p>
-            <w:r/>
-            <w:r>
-              <w:rPr>
-                <w:rFonts w:ascii="Calibri" w:hAnsi="Calibri" w:eastAsia="Calibri"/>
-                <w:b w:val="0"/>
-                <w:color w:val="000000"/>
-                <w:sz w:val="20"/>
-              </w:rPr>
-              <w:t>Buena</w:t>
+              <w:t>Cobre 2 pulgadas  ·  50 % de la clínica  ·  220 V a 15 m  ·  sensores 2 × 5 m  ·  señal M2M buena</w:t>
             </w:r>
           </w:p>
         </w:tc>
@@ -2271,67 +1717,12 @@
     </w:tbl>
     <w:p>
       <w:pPr>
-        <w:spacing w:after="80"/>
+        <w:spacing w:after="120"/>
       </w:pPr>
     </w:p>
     <w:p>
       <w:pPr>
-        <w:spacing w:before="120" w:after="40"/>
-        <w:jc w:val="center"/>
-      </w:pPr>
-      <w:r>
-        <w:drawing>
-          <wp:inline xmlns:a="http://schemas.openxmlformats.org/drawingml/2006/main" xmlns:pic="http://schemas.openxmlformats.org/drawingml/2006/picture">
-            <wp:extent cx="4206240" cy="3751512"/>
-            <wp:docPr id="4" name="Picture 4"/>
-            <wp:cNvGraphicFramePr>
-              <a:graphicFrameLocks noChangeAspect="1"/>
-            </wp:cNvGraphicFramePr>
-            <a:graphic>
-              <a:graphicData uri="http://schemas.openxmlformats.org/drawingml/2006/picture">
-                <pic:pic>
-                  <pic:nvPicPr>
-                    <pic:cNvPr id="0" name="sexto.png"/>
-                    <pic:cNvPicPr/>
-                  </pic:nvPicPr>
-                  <pic:blipFill>
-                    <a:blip r:embed="rId13"/>
-                    <a:stretch>
-                      <a:fillRect/>
-                    </a:stretch>
-                  </pic:blipFill>
-                  <pic:spPr>
-                    <a:xfrm>
-                      <a:off x="0" y="0"/>
-                      <a:ext cx="4206240" cy="3751512"/>
-                    </a:xfrm>
-                    <a:prstGeom prst="rect"/>
-                  </pic:spPr>
-                </pic:pic>
-              </a:graphicData>
-            </a:graphic>
-          </wp:inline>
-        </w:drawing>
-      </w:r>
-    </w:p>
-    <w:p>
-      <w:pPr>
-        <w:spacing w:after="160"/>
-        <w:jc w:val="center"/>
-      </w:pPr>
-      <w:r>
-        <w:rPr>
-          <w:rFonts w:ascii="Calibri" w:hAnsi="Calibri" w:eastAsia="Calibri"/>
-          <w:b w:val="0"/>
-          <w:color w:val="505050"/>
-          <w:sz w:val="18"/>
-        </w:rPr>
-        <w:t>Bomba del sexto piso sobre base de concreto, con aislación en la tubería. El piso de la sala estaba mojado el día de la visita.</w:t>
-      </w:r>
-    </w:p>
-    <w:p>
-      <w:pPr>
-        <w:spacing w:after="80" w:before="0" w:line="240" w:lineRule="auto"/>
+        <w:spacing w:after="40" w:before="0" w:line="240" w:lineRule="auto"/>
         <w:jc w:val="both"/>
       </w:pPr>
       <w:r>
@@ -2349,18 +1740,121 @@
         <w:tblW w:type="auto" w:w="0"/>
         <w:tblLayout w:type="autofit"/>
         <w:tblLook w:firstColumn="1" w:firstRow="1" w:lastColumn="0" w:lastRow="0" w:noHBand="0" w:noVBand="1" w:val="04A0"/>
+        <w:tblBorders>
+          <w:top w:val="single" w:sz="4" w:space="0" w:color="D0D7E2"/>
+          <w:left w:val="single" w:sz="4" w:space="0" w:color="D0D7E2"/>
+          <w:bottom w:val="single" w:sz="4" w:space="0" w:color="D0D7E2"/>
+          <w:right w:val="single" w:sz="4" w:space="0" w:color="D0D7E2"/>
+          <w:insideH w:val="single" w:sz="4" w:space="0" w:color="D0D7E2"/>
+          <w:insideV w:val="single" w:sz="4" w:space="0" w:color="D0D7E2"/>
+        </w:tblBorders>
       </w:tblPr>
       <w:tblGrid>
-        <w:gridCol w:w="4933"/>
-        <w:gridCol w:w="4933"/>
+        <w:gridCol w:w="9866"/>
       </w:tblGrid>
       <w:tr>
         <w:tc>
           <w:tcPr>
-            <w:tcW w:type="dxa" w:w="4933"/>
-            <w:shd w:fill="E8EEF6" w:val="clear"/>
+            <w:tcW w:type="dxa" w:w="9866"/>
+            <w:shd w:fill="F7F9FC" w:val="clear"/>
+            <w:tcMar>
+              <w:top w:w="60" w:type="dxa"/>
+              <w:left w:w="60" w:type="dxa"/>
+              <w:bottom w:w="60" w:type="dxa"/>
+              <w:right w:w="60" w:type="dxa"/>
+            </w:tcMar>
           </w:tcPr>
           <w:p>
+            <w:pPr>
+              <w:spacing w:before="80" w:after="40"/>
+              <w:jc w:val="center"/>
+            </w:pPr>
+            <w:r/>
+            <w:r>
+              <w:drawing>
+                <wp:inline xmlns:a="http://schemas.openxmlformats.org/drawingml/2006/main" xmlns:pic="http://schemas.openxmlformats.org/drawingml/2006/picture">
+                  <wp:extent cx="2350188" cy="2879999"/>
+                  <wp:docPr id="5" name="Picture 5"/>
+                  <wp:cNvGraphicFramePr>
+                    <a:graphicFrameLocks noChangeAspect="1"/>
+                  </wp:cNvGraphicFramePr>
+                  <a:graphic>
+                    <a:graphicData uri="http://schemas.openxmlformats.org/drawingml/2006/picture">
+                      <pic:pic>
+                        <pic:nvPicPr>
+                          <pic:cNvPr id="0" name="01.png"/>
+                          <pic:cNvPicPr/>
+                        </pic:nvPicPr>
+                        <pic:blipFill>
+                          <a:blip r:embed="rId14"/>
+                          <a:stretch>
+                            <a:fillRect/>
+                          </a:stretch>
+                        </pic:blipFill>
+                        <pic:spPr>
+                          <a:xfrm>
+                            <a:off x="0" y="0"/>
+                            <a:ext cx="2350188" cy="2879999"/>
+                          </a:xfrm>
+                          <a:prstGeom prst="rect"/>
+                        </pic:spPr>
+                      </pic:pic>
+                    </a:graphicData>
+                  </a:graphic>
+                </wp:inline>
+              </w:drawing>
+            </w:r>
+          </w:p>
+          <w:p>
+            <w:pPr>
+              <w:spacing w:after="40"/>
+              <w:jc w:val="center"/>
+            </w:pPr>
+            <w:r>
+              <w:rPr>
+                <w:rFonts w:ascii="Calibri" w:hAnsi="Calibri" w:eastAsia="Calibri"/>
+                <w:b/>
+                <w:color w:val="003366"/>
+                <w:sz w:val="16"/>
+              </w:rPr>
+              <w:t>Foto 1</w:t>
+            </w:r>
+          </w:p>
+        </w:tc>
+      </w:tr>
+    </w:tbl>
+    <w:tbl>
+      <w:tblPr>
+        <w:tblW w:type="auto" w:w="0"/>
+        <w:tblLook w:firstColumn="1" w:firstRow="1" w:lastColumn="0" w:lastRow="0" w:noHBand="0" w:noVBand="1" w:val="04A0"/>
+        <w:tblBorders>
+          <w:top w:val="single" w:sz="6" w:space="0" w:color="003366"/>
+          <w:left w:val="single" w:sz="6" w:space="0" w:color="003366"/>
+          <w:bottom w:val="single" w:sz="6" w:space="0" w:color="003366"/>
+          <w:right w:val="single" w:sz="6" w:space="0" w:color="003366"/>
+          <w:insideH w:val="single" w:sz="6" w:space="0" w:color="003366"/>
+          <w:insideV w:val="single" w:sz="6" w:space="0" w:color="003366"/>
+        </w:tblBorders>
+      </w:tblPr>
+      <w:tblGrid>
+        <w:gridCol w:w="9866"/>
+      </w:tblGrid>
+      <w:tr>
+        <w:tc>
+          <w:tcPr>
+            <w:tcW w:type="dxa" w:w="9866"/>
+            <w:shd w:fill="F4F7FB" w:val="clear"/>
+            <w:tcMar>
+              <w:top w:w="90" w:type="dxa"/>
+              <w:left w:w="90" w:type="dxa"/>
+              <w:bottom w:w="90" w:type="dxa"/>
+              <w:right w:w="90" w:type="dxa"/>
+            </w:tcMar>
+          </w:tcPr>
+          <w:p>
+            <w:pPr>
+              <w:spacing w:after="40"/>
+            </w:pPr>
             <w:r/>
             <w:r>
               <w:rPr>
@@ -2369,16 +1863,14 @@
                 <w:color w:val="003366"/>
                 <w:sz w:val="20"/>
               </w:rPr>
-              <w:t>Diámetro</w:t>
+              <w:t>Descripción del sitio</w:t>
             </w:r>
           </w:p>
-        </w:tc>
-        <w:tc>
-          <w:tcPr>
-            <w:tcW w:type="dxa" w:w="4933"/>
-          </w:tcPr>
           <w:p>
-            <w:r/>
+            <w:pPr>
+              <w:spacing w:after="80"/>
+              <w:jc w:val="both"/>
+            </w:pPr>
             <w:r>
               <w:rPr>
                 <w:rFonts w:ascii="Calibri" w:hAnsi="Calibri" w:eastAsia="Calibri"/>
@@ -2386,270 +1878,21 @@
                 <w:color w:val="000000"/>
                 <w:sz w:val="20"/>
               </w:rPr>
-              <w:t>2 pulgadas</w:t>
+              <w:t>Medidor mecánico de Aguas Antofagasta. El ultrasonido se instala en el tramo recto de cobre de 2 pulgadas que corre sobre el medidor.</w:t>
             </w:r>
           </w:p>
-        </w:tc>
-      </w:tr>
-      <w:tr>
-        <w:tc>
-          <w:tcPr>
-            <w:tcW w:type="dxa" w:w="4933"/>
-            <w:shd w:fill="E8EEF6" w:val="clear"/>
-          </w:tcPr>
           <w:p>
-            <w:r/>
-            <w:r>
-              <w:rPr>
-                <w:rFonts w:ascii="Calibri" w:hAnsi="Calibri" w:eastAsia="Calibri"/>
-                <w:b/>
-                <w:color w:val="003366"/>
-                <w:sz w:val="20"/>
-              </w:rPr>
-              <w:t>Material de la matriz</w:t>
-            </w:r>
-          </w:p>
-        </w:tc>
-        <w:tc>
-          <w:tcPr>
-            <w:tcW w:type="dxa" w:w="4933"/>
-            <w:shd w:fill="F7F9FC" w:val="clear"/>
-          </w:tcPr>
-          <w:p>
-            <w:r/>
+            <w:pPr>
+              <w:spacing w:after="20"/>
+            </w:pPr>
             <w:r>
               <w:rPr>
                 <w:rFonts w:ascii="Calibri" w:hAnsi="Calibri" w:eastAsia="Calibri"/>
                 <w:b w:val="0"/>
-                <w:color w:val="000000"/>
-                <w:sz w:val="20"/>
+                <w:color w:val="464646"/>
+                <w:sz w:val="16"/>
               </w:rPr>
-              <w:t>Cobre</w:t>
-            </w:r>
-          </w:p>
-        </w:tc>
-      </w:tr>
-      <w:tr>
-        <w:tc>
-          <w:tcPr>
-            <w:tcW w:type="dxa" w:w="4933"/>
-            <w:shd w:fill="E8EEF6" w:val="clear"/>
-          </w:tcPr>
-          <w:p>
-            <w:r/>
-            <w:r>
-              <w:rPr>
-                <w:rFonts w:ascii="Calibri" w:hAnsi="Calibri" w:eastAsia="Calibri"/>
-                <w:b/>
-                <w:color w:val="003366"/>
-                <w:sz w:val="20"/>
-              </w:rPr>
-              <w:t>Actividad hídrica</w:t>
-            </w:r>
-          </w:p>
-        </w:tc>
-        <w:tc>
-          <w:tcPr>
-            <w:tcW w:type="dxa" w:w="4933"/>
-          </w:tcPr>
-          <w:p>
-            <w:r/>
-            <w:r>
-              <w:rPr>
-                <w:rFonts w:ascii="Calibri" w:hAnsi="Calibri" w:eastAsia="Calibri"/>
-                <w:b w:val="0"/>
-                <w:color w:val="000000"/>
-                <w:sz w:val="20"/>
-              </w:rPr>
-              <w:t>100 % de la clínica (cuenta de agua)</w:t>
-            </w:r>
-          </w:p>
-        </w:tc>
-      </w:tr>
-      <w:tr>
-        <w:tc>
-          <w:tcPr>
-            <w:tcW w:type="dxa" w:w="4933"/>
-            <w:shd w:fill="E8EEF6" w:val="clear"/>
-          </w:tcPr>
-          <w:p>
-            <w:r/>
-            <w:r>
-              <w:rPr>
-                <w:rFonts w:ascii="Calibri" w:hAnsi="Calibri" w:eastAsia="Calibri"/>
-                <w:b/>
-                <w:color w:val="003366"/>
-                <w:sz w:val="20"/>
-              </w:rPr>
-              <w:t>Remarcador del cliente</w:t>
-            </w:r>
-          </w:p>
-        </w:tc>
-        <w:tc>
-          <w:tcPr>
-            <w:tcW w:type="dxa" w:w="4933"/>
-            <w:shd w:fill="F7F9FC" w:val="clear"/>
-          </w:tcPr>
-          <w:p>
-            <w:r/>
-            <w:r>
-              <w:rPr>
-                <w:rFonts w:ascii="Calibri" w:hAnsi="Calibri" w:eastAsia="Calibri"/>
-                <w:b w:val="0"/>
-                <w:color w:val="000000"/>
-                <w:sz w:val="20"/>
-              </w:rPr>
-              <w:t>No existe</w:t>
-            </w:r>
-          </w:p>
-        </w:tc>
-      </w:tr>
-      <w:tr>
-        <w:tc>
-          <w:tcPr>
-            <w:tcW w:type="dxa" w:w="4933"/>
-            <w:shd w:fill="E8EEF6" w:val="clear"/>
-          </w:tcPr>
-          <w:p>
-            <w:r/>
-            <w:r>
-              <w:rPr>
-                <w:rFonts w:ascii="Calibri" w:hAnsi="Calibri" w:eastAsia="Calibri"/>
-                <w:b/>
-                <w:color w:val="003366"/>
-                <w:sz w:val="20"/>
-              </w:rPr>
-              <w:t>Factibilidad eléctrica 220 V</w:t>
-            </w:r>
-          </w:p>
-        </w:tc>
-        <w:tc>
-          <w:tcPr>
-            <w:tcW w:type="dxa" w:w="4933"/>
-          </w:tcPr>
-          <w:p>
-            <w:r/>
-            <w:r>
-              <w:rPr>
-                <w:rFonts w:ascii="Calibri" w:hAnsi="Calibri" w:eastAsia="Calibri"/>
-                <w:b w:val="0"/>
-                <w:color w:val="000000"/>
-                <w:sz w:val="20"/>
-              </w:rPr>
-              <w:t>5 m</w:t>
-            </w:r>
-          </w:p>
-        </w:tc>
-      </w:tr>
-      <w:tr>
-        <w:tc>
-          <w:tcPr>
-            <w:tcW w:type="dxa" w:w="4933"/>
-            <w:shd w:fill="E8EEF6" w:val="clear"/>
-          </w:tcPr>
-          <w:p>
-            <w:r/>
-            <w:r>
-              <w:rPr>
-                <w:rFonts w:ascii="Calibri" w:hAnsi="Calibri" w:eastAsia="Calibri"/>
-                <w:b/>
-                <w:color w:val="003366"/>
-                <w:sz w:val="20"/>
-              </w:rPr>
-              <w:t>Canalización de señal</w:t>
-            </w:r>
-          </w:p>
-        </w:tc>
-        <w:tc>
-          <w:tcPr>
-            <w:tcW w:type="dxa" w:w="4933"/>
-            <w:shd w:fill="F7F9FC" w:val="clear"/>
-          </w:tcPr>
-          <w:p>
-            <w:r/>
-            <w:r>
-              <w:rPr>
-                <w:rFonts w:ascii="Calibri" w:hAnsi="Calibri" w:eastAsia="Calibri"/>
-                <w:b w:val="0"/>
-                <w:color w:val="000000"/>
-                <w:sz w:val="20"/>
-              </w:rPr>
-              <w:t>No aplica</w:t>
-            </w:r>
-          </w:p>
-        </w:tc>
-      </w:tr>
-      <w:tr>
-        <w:tc>
-          <w:tcPr>
-            <w:tcW w:type="dxa" w:w="4933"/>
-            <w:shd w:fill="E8EEF6" w:val="clear"/>
-          </w:tcPr>
-          <w:p>
-            <w:r/>
-            <w:r>
-              <w:rPr>
-                <w:rFonts w:ascii="Calibri" w:hAnsi="Calibri" w:eastAsia="Calibri"/>
-                <w:b/>
-                <w:color w:val="003366"/>
-                <w:sz w:val="20"/>
-              </w:rPr>
-              <w:t>Canalización sensores ultrasonido</w:t>
-            </w:r>
-          </w:p>
-        </w:tc>
-        <w:tc>
-          <w:tcPr>
-            <w:tcW w:type="dxa" w:w="4933"/>
-          </w:tcPr>
-          <w:p>
-            <w:r/>
-            <w:r>
-              <w:rPr>
-                <w:rFonts w:ascii="Calibri" w:hAnsi="Calibri" w:eastAsia="Calibri"/>
-                <w:b w:val="0"/>
-                <w:color w:val="000000"/>
-                <w:sz w:val="20"/>
-              </w:rPr>
-              <w:t>2 × 5 m</w:t>
-            </w:r>
-          </w:p>
-        </w:tc>
-      </w:tr>
-      <w:tr>
-        <w:tc>
-          <w:tcPr>
-            <w:tcW w:type="dxa" w:w="4933"/>
-            <w:shd w:fill="E8EEF6" w:val="clear"/>
-          </w:tcPr>
-          <w:p>
-            <w:r/>
-            <w:r>
-              <w:rPr>
-                <w:rFonts w:ascii="Calibri" w:hAnsi="Calibri" w:eastAsia="Calibri"/>
-                <w:b/>
-                <w:color w:val="003366"/>
-                <w:sz w:val="20"/>
-              </w:rPr>
-              <w:t>Señal M2M 3G, 4G, 5G</w:t>
-            </w:r>
-          </w:p>
-        </w:tc>
-        <w:tc>
-          <w:tcPr>
-            <w:tcW w:type="dxa" w:w="4933"/>
-            <w:shd w:fill="F7F9FC" w:val="clear"/>
-          </w:tcPr>
-          <w:p>
-            <w:r/>
-            <w:r>
-              <w:rPr>
-                <w:rFonts w:ascii="Calibri" w:hAnsi="Calibri" w:eastAsia="Calibri"/>
-                <w:b w:val="0"/>
-                <w:color w:val="000000"/>
-                <w:sz w:val="20"/>
-              </w:rPr>
-              <w:t>Buena</w:t>
+              <w:t>Cobre 2 pulgadas  ·  100 % de la clínica (cuenta de agua)  ·  220 V a 5 m  ·  sensores 2 × 5 m  ·  señal M2M buena</w:t>
             </w:r>
           </w:p>
         </w:tc>
@@ -2657,63 +1900,8 @@
     </w:tbl>
     <w:p>
       <w:pPr>
-        <w:spacing w:after="80"/>
+        <w:spacing w:after="120"/>
       </w:pPr>
-    </w:p>
-    <w:p>
-      <w:pPr>
-        <w:spacing w:before="120" w:after="40"/>
-        <w:jc w:val="center"/>
-      </w:pPr>
-      <w:r>
-        <w:drawing>
-          <wp:inline xmlns:a="http://schemas.openxmlformats.org/drawingml/2006/main" xmlns:pic="http://schemas.openxmlformats.org/drawingml/2006/picture">
-            <wp:extent cx="4206240" cy="5154468"/>
-            <wp:docPr id="5" name="Picture 5"/>
-            <wp:cNvGraphicFramePr>
-              <a:graphicFrameLocks noChangeAspect="1"/>
-            </wp:cNvGraphicFramePr>
-            <a:graphic>
-              <a:graphicData uri="http://schemas.openxmlformats.org/drawingml/2006/picture">
-                <pic:pic>
-                  <pic:nvPicPr>
-                    <pic:cNvPr id="0" name="sanitaria.png"/>
-                    <pic:cNvPicPr/>
-                  </pic:nvPicPr>
-                  <pic:blipFill>
-                    <a:blip r:embed="rId14"/>
-                    <a:stretch>
-                      <a:fillRect/>
-                    </a:stretch>
-                  </pic:blipFill>
-                  <pic:spPr>
-                    <a:xfrm>
-                      <a:off x="0" y="0"/>
-                      <a:ext cx="4206240" cy="5154468"/>
-                    </a:xfrm>
-                    <a:prstGeom prst="rect"/>
-                  </pic:spPr>
-                </pic:pic>
-              </a:graphicData>
-            </a:graphic>
-          </wp:inline>
-        </w:drawing>
-      </w:r>
-    </w:p>
-    <w:p>
-      <w:pPr>
-        <w:spacing w:after="160"/>
-        <w:jc w:val="center"/>
-      </w:pPr>
-      <w:r>
-        <w:rPr>
-          <w:rFonts w:ascii="Calibri" w:hAnsi="Calibri" w:eastAsia="Calibri"/>
-          <w:b w:val="0"/>
-          <w:color w:val="505050"/>
-          <w:sz w:val="18"/>
-        </w:rPr>
-        <w:t>Medidor mecánico de Aguas Antofagasta. El ultrasonido se instala en el tramo recto de cobre de 2 pulgadas que corre sobre el medidor.</w:t>
-      </w:r>
     </w:p>
     <w:p>
       <w:pPr>

</xml_diff>